<commit_message>
added ai template for lab 2
</commit_message>
<xml_diff>
--- a/BA/Part 2_Requirements Classification-20260912/Done/AI/FilledTemplates/Requirements_Classification_Template.docx
+++ b/BA/Part 2_Requirements Classification-20260912/Done/AI/FilledTemplates/Requirements_Classification_Template.docx
@@ -22,7 +22,7 @@
           <w:sz w:val="36"/>
           <w:szCs w:val="36"/>
         </w:rPr>
-        <w:t>VNS — Custom University Learning Platform · Team «20/80», Lviv Polytechnic National University</w:t>
+        <w:t>Team «20/80» · Lviv Polytechnic National University · VNS Custom Learning Platform</w:t>
       </w:r>
       <w:r>
         <w:rPr>
@@ -103,7 +103,7 @@
           <w:sz w:val="28"/>
           <w:szCs w:val="28"/>
         </w:rPr>
-        <w:t>Bring course content, deadlines and grades into a single university-owned platform, so that the legacy VNS (Moodle) stops being the only place students check: at least 70 % of the pilot courses run fully in the new platform by the end of the spring 2027 semester.</w:t>
+        <w:t>Bring all courses, deadlines and grades into the university's own platform so that the old VNS (Moodle) is not the only place students have to check: at least 70 % of the pilot courses are run fully on the new platform by the end of the spring 2027 semester.</w:t>
       </w:r>
       <w:r>
         <w:rPr>
@@ -132,7 +132,7 @@
           <w:sz w:val="28"/>
           <w:szCs w:val="28"/>
         </w:rPr>
-        <w:t>Move course communication out of Telegram and Discord into the platform, so that questions, answers and announcements stay searchable and tied to their course: at least 60 % of course questions are asked and answered inside the product during the pilot.</w:t>
+        <w:t>Keep every course discussion inside the product instead of Telegram and Discord, so that nothing is lost outside the system: during the pilot at least 60 % of course questions are asked and answered here.</w:t>
       </w:r>
       <w:r>
         <w:rPr>
@@ -161,7 +161,7 @@
           <w:sz w:val="28"/>
           <w:szCs w:val="28"/>
         </w:rPr>
-        <w:t>Replace the misleading grade summary with a trustworthy picture (earned / achieved / maximum points per course) and use it to raise the share of on-time submissions in the pilot groups compared with the previous semester.</w:t>
+        <w:t>Give students a fair grade summary (points earned, points earned so far, points still available) and raise the share of on-time submissions in the pilot groups compared with the previous semester.</w:t>
       </w:r>
     </w:p>
     <w:p>
@@ -217,7 +217,7 @@
           <w:sz w:val="28"/>
           <w:szCs w:val="28"/>
         </w:rPr>
-        <w:t>Students and lecturers should have one place for materials, deadlines, grades and course communication, without switching between the VNS, Telegram and cloud drives.</w:t>
+        <w:t>Students and lecturers want a single place for lectures, deadlines, grades and discussion, so they stop switching between the VNS, Telegram and cloud storage.</w:t>
       </w:r>
     </w:p>
     <w:p>
@@ -239,7 +239,7 @@
           <w:sz w:val="28"/>
           <w:szCs w:val="28"/>
         </w:rPr>
-        <w:t>Lecturers and course teams should see who is falling behind and ask fewer repeated questions: activity analytics per group, a Q&amp;A channel with accepted answers, and an AI assistant restricted to the course materials.</w:t>
+        <w:t>Lecturers want to see how the group is doing and to answer each question only once: activity analytics, a Q&amp;A channel with accepted answers, and an AI helper that answers only from the course materials.</w:t>
       </w:r>
     </w:p>
     <w:p>
@@ -261,7 +261,7 @@
           <w:sz w:val="28"/>
           <w:szCs w:val="28"/>
         </w:rPr>
-        <w:t>The sponsor (Lviv Polytechnic) and the Ministry of Education and Science should get a platform that is legally compliant and maintainable in-house: protection of personal data, semester reporting and no dependency on an external LMS vendor.</w:t>
+        <w:t>Lviv Polytechnic and the Ministry of Education and Science expect the platform to comply with Ukrainian personal data law, to produce semester reports and not to depend on a commercial LMS vendor.</w:t>
       </w:r>
     </w:p>
     <w:p>
@@ -333,7 +333,7 @@
           <w:sz w:val="28"/>
           <w:szCs w:val="28"/>
         </w:rPr>
-        <w:t>(5):</w:t>
+        <w:t>(6):</w:t>
       </w:r>
     </w:p>
     <w:p>
@@ -355,7 +355,7 @@
           <w:sz w:val="28"/>
           <w:szCs w:val="28"/>
         </w:rPr>
-        <w:t>Student should be able to register and sign in through the dean's registry import (student card number → email + password), receiving role and group assignment automatically.</w:t>
+        <w:t>A student should be able to register and log in with the student card number from the dean's registry import; the system checks that the number is in the registry and not yet taken, the student sets an email and password and confirms the email, and the role and group are assigned automatically from the registry.</w:t>
       </w:r>
     </w:p>
     <w:p>
@@ -377,7 +377,7 @@
           <w:sz w:val="28"/>
           <w:szCs w:val="28"/>
         </w:rPr>
-        <w:t>Student should be able to see the schedule, deadlines and grades, with a grade forecast showing earned, achieved-for-graded-work and maximum points instead of the misleading average.</w:t>
+        <w:t>A student should be able to open a course and see the timetable, upcoming deadlines and grades, including a forecast of the final grade (points earned / result for the graded work so far / maximum attainable) and a "what do I need for grade X" simulator, with reminders 72, 24 and 3 hours before a deadline if the work is not yet submitted.</w:t>
       </w:r>
     </w:p>
     <w:p>
@@ -399,7 +399,7 @@
           <w:sz w:val="28"/>
           <w:szCs w:val="28"/>
         </w:rPr>
-        <w:t>Every course + group should automatically get a communication space with channels (#announcements, #questions, #module-N, #lab-N) supporting real-time messaging, threads, mentions and file sharing.</w:t>
+        <w:t>A lecturer should get an automatically created channel space for every course and group, with announcement, general, Q&amp;A (with accepted answers), module and lab channels supporting real-time messages, threads and file exchange.</w:t>
       </w:r>
     </w:p>
     <w:p>
@@ -421,7 +421,7 @@
           <w:sz w:val="28"/>
           <w:szCs w:val="28"/>
         </w:rPr>
-        <w:t>Student should be able to create or join a Study Space around a topic and work there with shared materials and a team task board.</w:t>
+        <w:t>A student should be able to create or join a Study Space by topic and manage shared files and a team task board inside it.</w:t>
       </w:r>
     </w:p>
     <w:p>
@@ -443,7 +443,29 @@
           <w:sz w:val="28"/>
           <w:szCs w:val="28"/>
         </w:rPr>
-        <w:t>Student should be able to ask the AI assistant for a summary, a quiz, flashcards or an answer, always grounded in the course materials and always linked to its sources.</w:t>
+        <w:t>A student should be able to request a summary, a quiz, flashcards or an answer from the AI assistant, and every answer must refer to the material it was taken from or say that nothing was found in the course materials; the AI must follow the AI mode set by the lecturer.</w:t>
+      </w:r>
+    </w:p>
+    <w:p>
+      <w:pPr>
+        <w:pStyle w:val="NoSpacing"/>
+        <w:numPr>
+          <w:ilvl w:val="0"/>
+          <w:numId w:val="5"/>
+        </w:numPr>
+        <w:rPr>
+          <w:rFonts w:ascii="Times New Roman" w:hAnsi="Times New Roman" w:cs="Times New Roman"/>
+          <w:sz w:val="28"/>
+          <w:szCs w:val="28"/>
+        </w:rPr>
+      </w:pPr>
+      <w:r>
+        <w:rPr>
+          <w:rFonts w:ascii="Times New Roman" w:hAnsi="Times New Roman" w:cs="Times New Roman"/>
+          <w:sz w:val="28"/>
+          <w:szCs w:val="28"/>
+        </w:rPr>
+        <w:t>A lecturer should be able to see activity analytics for the group (who is falling behind, who has not logged in), and the administrator should be able to get course and student statistics for semester reports.</w:t>
       </w:r>
     </w:p>
     <w:p>
@@ -514,7 +536,7 @@
           <w:sz w:val="28"/>
           <w:szCs w:val="28"/>
         </w:rPr>
-        <w:t>Personal data and course content must be protected: course-level access control, hashed passwords with JWT, signed file links, and permission filtering applied before search results or AI answers are generated — in line with the Law of Ukraine on Personal Data Protection and GDPR principles.</w:t>
+        <w:t>All personal data and course content must be kept safe: role and course level access checks, hashed passwords, JWT sessions and access filtering applied before any search result or AI answer is produced (Law of Ukraine on Personal Data Protection, GDPR principles).</w:t>
       </w:r>
     </w:p>
     <w:p>
@@ -536,7 +558,7 @@
           <w:sz w:val="28"/>
           <w:szCs w:val="28"/>
         </w:rPr>
-        <w:t>The platform must stay available and responsive during the semester: page load ≤ 2 s, messages delivered in real time, availability ≥ 99.5 %; AI generation runs in a queue and is cached, so it never blocks the user interface.</w:t>
+        <w:t>The platform must stay fast and up during the semester: pages open within 2 seconds, chat messages appear in real time, uptime is at least 99.5 %, and heavy AI jobs run in the background without freezing the interface.</w:t>
       </w:r>
     </w:p>
     <w:p>
@@ -558,7 +580,7 @@
           <w:sz w:val="28"/>
           <w:szCs w:val="28"/>
         </w:rPr>
-        <w:t>The interface must be mobile-first, installable as a PWA and accessible: WCAG 2.2 AA, keyboard navigation, light and dark themes, UA/EN localization, offline access to downloaded materials and flashcards.</w:t>
+        <w:t>The product must work well on phones and be open to everyone: installable PWA, WCAG 2.2 AA, keyboard-only navigation, dark theme, Ukrainian and English languages, offline access to saved materials and flashcards.</w:t>
       </w:r>
     </w:p>
     <w:p>
@@ -628,7 +650,7 @@
           <w:sz w:val="28"/>
           <w:szCs w:val="28"/>
         </w:rPr>
-        <w:t>Users of the old VNS must be migrated and onboarded: import of the student and lecturer registry, courses and grade history before the pilot starts, plus short in-app guides and a help section for the new features.</w:t>
+        <w:t>Old VNS users must be moved to the new platform and shown how to use it: the dean's registry (CSV) imported by the administrator and courses and groups set up before the pilot starts, plus short onboarding tips and help pages for the new functions.</w:t>
       </w:r>
     </w:p>
     <w:p>
@@ -702,7 +724,7 @@
           <w:sz w:val="28"/>
           <w:szCs w:val="28"/>
         </w:rPr>
-        <w:t>The dean's office can export a registry of students and lecturers (CSV), so registration works without any integration with Moodle.</w:t>
+        <w:t>The dean's office is able to export a CSV list of students and lecturers, so we do not need Moodle to fill the system with users.</w:t>
       </w:r>
     </w:p>
     <w:p>
@@ -724,7 +746,7 @@
           <w:sz w:val="28"/>
           <w:szCs w:val="28"/>
         </w:rPr>
-        <w:t>An external LLM API is available, affordable and permitted to process course materials, with shared results cached and a daily request limit per user.</w:t>
+        <w:t>An external LLM API can be used for our course materials, is affordable for the project and is allowed by the data processing rules, with cached results and a daily limit per user.</w:t>
       </w:r>
     </w:p>
     <w:p>
@@ -800,7 +822,7 @@
           <w:sz w:val="28"/>
           <w:szCs w:val="28"/>
         </w:rPr>
-        <w:t>The team decided on 22/09/2026 to build a custom backend with no Moodle integration, so all course, group and grade data must be imported and maintained inside the product itself.</w:t>
+        <w:t>The team has chosen a custom backend with no Moodle integration (decision of 22/09/2026), so every course, group and grade has to be entered or imported by us.</w:t>
       </w:r>
     </w:p>
     <w:p>
@@ -822,7 +844,7 @@
           <w:sz w:val="28"/>
           <w:szCs w:val="28"/>
         </w:rPr>
-        <w:t>The project is a demonstration study case delivered by a five-person student team by 31/01/2027, under Ukrainian personal data law and academic integrity rules.</w:t>
+        <w:t>The work is a demonstration study case done by five students and due on 31/01/2027 under Ukrainian personal data law and academic integrity rules.</w:t>
       </w:r>
     </w:p>
     <w:p>
@@ -898,7 +920,7 @@
           <w:sz w:val="28"/>
           <w:szCs w:val="28"/>
         </w:rPr>
-        <w:t>The lecturer decides which AI features are enabled for a course or assignment; the AI never writes a complete solution for a graded task and always marks its content as AI-generated.</w:t>
+        <w:t>The lecturer decides which AI features are switched on for a course or an assignment, and the AI must never write a finished solution for a graded task; AI-generated content is always marked.</w:t>
       </w:r>
     </w:p>
     <w:p>
@@ -920,7 +942,7 @@
           <w:sz w:val="28"/>
           <w:szCs w:val="28"/>
         </w:rPr>
-        <w:t>Gamification rewards (XP, streaks, reward shop) never affect the official grade unless the lecturer explicitly enables a bonus for a course; rankings are opt-in and show only the top-10 and the user's own position.</w:t>
+        <w:t>XP, streaks and the reward shop must never change an official grade unless the lecturer has explicitly enabled a bonus for that course; rankings are optional and show only the top-10 and the student's own place.</w:t>
       </w:r>
     </w:p>
     <w:sectPr>

</xml_diff>